<commit_message>
Updated files until today; Adding all google doc files converted to word/excel/pdf
</commit_message>
<xml_diff>
--- a/1. Languages/2. English/2. Grade2/0.Books/1.LifeOfMahavira-1908-Summary.docx
+++ b/1. Languages/2. English/2. Grade2/0.Books/1.LifeOfMahavira-1908-Summary.docx
@@ -234,11 +234,11 @@
       </w:pPr>
       <w:sdt>
         <w:sdtPr>
-          <w:id w:val="-1912506986"/>
+          <w:id w:val="1642761699"/>
           <w:tag w:val="goog_rdk_1"/>
         </w:sdtPr>
         <w:sdtContent>
-          <w:del w:author="Virata Pusuluri" w:id="0" w:date="2026-01-27T19:06:28Z">
+          <w:del w:author="Virata Pusuluri" w:id="0" w:date="2026-02-03T20:59:21Z">
             <w:r>
               <w:rPr>
                 <w:rtl w:val="0"/>
@@ -1161,7 +1161,7 @@
 
 <file path=customXML/item1.xml><?xml version="1.0" encoding="utf-8"?>
 <go:gDocsCustomXmlDataStorage xmlns:go="http://customooxmlschemas.google.com/" xmlns:r="http://schemas.openxmlformats.org/officeDocument/2006/relationships" uri="GoogleDocsCustomDataVersion2">
-  <go:docsCustomData xmlns:go="http://customooxmlschemas.google.com/" roundtripDataSignature="AMtx7mj6jXp3SY4mPNjkmrseQxIKarC5LQ==">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</go:docsCustomData>
+  <go:docsCustomData xmlns:go="http://customooxmlschemas.google.com/" roundtripDataSignature="AMtx7mi6HPKuZymejcBKdUvH1wQOEt9PnA==">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</go:docsCustomData>
 </go:gDocsCustomXmlDataStorage>
 </file>
 

</xml_diff>